<commit_message>
Correct S1 cost-saving figures in Paper 1 (1000x/scaling error)
Verified against the exact PyPSA objective (full-year, GRID_CAPACITY_CHARGE=120):
- S1 annual operational cost saving vs S0: £42.4k -> £70.9k
- S1 20-year saving: £847k -> £1,418k
Corrected in the abstract, results and conclusion (paras 5,10,102,106,127,128,145).
Matches the figures already flagged in 05_papers/paper1/HEAT_PUMP_PEAK_FINDING.md.
S3 saving (£17.4k) left unchanged pending a definitional decision on whether the
capacity-charge term counts as operational energy cost (objective-based run gives
~£23.4k). Solar fractions and CO2 figures verified correct and unchanged.
</commit_message>
<xml_diff>
--- a/EdenCampus_PhD/05_papers/paper1/Paper1_Eden_Campus_Manuscript.docx
+++ b/EdenCampus_PhD/05_papers/paper1/Paper1_Eden_Campus_Manuscript.docx
@@ -89,7 +89,7 @@
           <w:sz w:val="22"/>
           <w:szCs w:val="22"/>
         </w:rPr>
-        <w:t xml:space="preserve">Business parks represent a significant yet under-studied opportunity for commercial decarbonisation, particularly in cool-temperate climates where renewable generation and demand profiles are temporally misaligned. This paper presents a multi-vector digital twin framework for evaluating distributed energy storage configurations in business parks, using Eden Campus in Fife, Scotland as a case study. A four-layer architecture integrates real-time data acquisition, physics-based component modelling, multi-objective optimisation through PyPSA, and stakeholder visualisation, enabling rigorous comparison across storage technologies. Five system configurations are evaluated over 8,760 hours of optimised dispatch: solar PV only (S0), PV with lithium-ion battery (S1), PV with phase-change thermal storage (S2), PV with hydrogen long-duration storage (S3), and a full hybrid system combining all three storage types (S4). Results show that S1 (PV+BESS) is the operationally optimal configuration, achieving 38.8% annual solar fraction, 217.2 tonnes of CO₂ savings per year, and £42,400 in annual operational cost savings against the PV-only baseline — equivalent to £847,000 over a 20-year asset lifetime. Sensitivity analysis across four weather years (2020–2023), grid prices spanning £180–380/MWh, and BESS capacities from 200 to 4,000 kWh confirms result robustness. A novel finding is that scenarios involving heat pump electrification (S2 and S4) increase electrical peak demand by 32%, revealing a previously under-reported trade-off between thermal decarbonisation and electrical grid impact. The framework provides a reproducible decision-support tool for net-zero planning in commercial real estate.</w:t>
+        <w:t>Business parks represent a significant yet under-studied opportunity for commercial decarbonisation, particularly in cool-temperate climates where renewable generation and demand profiles are temporally misaligned. This paper presents a multi-vector digital twin framework for evaluating distributed energy storage configurations in business parks, using Eden Campus in Fife, Scotland as a case study. A four-layer architecture integrates real-time data acquisition, physics-based component modelling, multi-objective optimisation through PyPSA, and stakeholder visualisation, enabling rigorous comparison across storage technologies. Five system configurations are evaluated over 8,760 hours of optimised dispatch: solar PV only (S0), PV with lithium-ion battery (S1), PV with phase-change thermal storage (S2), PV with hydrogen long-duration storage (S3), and a full hybrid system combining all three storage types (S4). Results show that S1 (PV+BESS) is the operationally optimal configuration, achieving 38.8% annual solar fraction, 217.2 tonnes of CO₂ savings per year, and £70,900 in annual operational cost savings against the PV-only baseline — equivalent to £1,418,000 over a 20-year asset lifetime. Sensitivity analysis across four weather years (2020–2023), grid prices spanning £180–380/MWh, and BESS capacities from 200 to 4,000 kWh confirms result robustness. A novel finding is that scenarios involving heat pump electrification (S2 and S4) increase electrical peak demand by 32%, revealing a previously under-reported trade-off between thermal decarbonisation and electrical grid impact. The framework provides a reproducible decision-support tool for net-zero planning in commercial real estate.</w:t>
       </w:r>
     </w:p>
     <w:p>
@@ -182,7 +182,7 @@
           <w:sz w:val="22"/>
           <w:szCs w:val="22"/>
         </w:rPr>
-        <w:t xml:space="preserve">PV+BESS (S1) saves 217 tCO₂/yr and £847k over 20 years vs PV-only baseline</w:t>
+        <w:t>PV+BESS (S1) saves 217 tCO₂/yr and £1,418k over 20 years vs PV-only baseline</w:t>
       </w:r>
     </w:p>
     <w:p>
@@ -8090,7 +8090,7 @@
           <w:sz w:val="22"/>
           <w:szCs w:val="22"/>
         </w:rPr>
-        <w:t xml:space="preserve">Across the five scenarios evaluated over a full year of operation (Table 3, Figure 4), battery storage (S1) emerges as the operationally optimal configuration, delivering the largest reduction in annual cost (£42.4k saving versus the baseline) while securing 38.8% solar fraction and 217.2 tonnes of CO₂ savings annually. Full-system hybridisation (S4) achieves the highest renewable utilisation at 42.7% solar fraction, but at substantially higher operational cost due to heat pump electrical demand.</w:t>
+        <w:t>Across the five scenarios evaluated over a full year of operation (Table 3, Figure 4), battery storage (S1) emerges as the operationally optimal configuration, delivering the largest reduction in annual cost (£70.9k saving versus the baseline) while securing 38.8% solar fraction and 217.2 tonnes of CO₂ savings annually. Full-system hybridisation (S4) achieves the highest renewable utilisation at 42.7% solar fraction, but at substantially higher operational cost due to heat pump electrical demand.</w:t>
       </w:r>
     </w:p>
     <w:p>
@@ -9308,7 +9308,7 @@
           <w:sz w:val="22"/>
           <w:szCs w:val="22"/>
         </w:rPr>
-        <w:t xml:space="preserve">Battery storage (S1) raises solar fraction by 7 percentage points to 38.8% and reduces annual operational cost by £42.4k. The mechanism is straightforward: surplus midday solar generation is stored rather than exported at low SEG rates, then discharged during evening peaks when grid tariffs are highest, displacing high-cost imports.</w:t>
+        <w:t>Battery storage (S1) raises solar fraction by 7 percentage points to 38.8% and reduces annual operational cost by £70.9k. The mechanism is straightforward: surplus midday solar generation is stored rather than exported at low SEG rates, then discharged during evening peaks when grid tariffs are highest, displacing high-cost imports.</w:t>
       </w:r>
     </w:p>
     <w:p>
@@ -10385,7 +10385,7 @@
           <w:sz w:val="22"/>
           <w:szCs w:val="22"/>
         </w:rPr>
-        <w:t xml:space="preserve">The clear operational primacy of S1 (PV+BESS) — combining the lowest annual cost, the second-highest CO₂ savings, and no peak demand penalty — has direct implications for capital allocation in the commercial real estate sector. Across the 20-year operational projection, S1 delivers cumulative cost savings of £847k against the unstored baseline, equivalent to £42.4k per year of avoided grid imports through tariff arbitrage and surplus PV capture. Crucially, this case is built on operational economics alone, before any consideration of capital depreciation, asset replacement cycles, or future scenarios of carbon pricing and rising commercial tariffs.</w:t>
+        <w:t>The clear operational primacy of S1 (PV+BESS) — combining the lowest annual cost, the second-highest CO₂ savings, and no peak demand penalty — has direct implications for capital allocation in the commercial real estate sector. Across the 20-year operational projection, S1 delivers cumulative cost savings of £1,418k against the unstored baseline, equivalent to £70.9k per year of avoided grid imports through tariff arbitrage and surplus PV capture. Crucially, this case is built on operational economics alone, before any consideration of capital depreciation, asset replacement cycles, or future scenarios of carbon pricing and rising commercial tariffs.</w:t>
       </w:r>
     </w:p>
     <w:p>
@@ -10399,7 +10399,7 @@
           <w:sz w:val="22"/>
           <w:szCs w:val="22"/>
         </w:rPr>
-        <w:t xml:space="preserve">Comparison with hydrogen long-duration storage (S3) is particularly informative. While S3 marginally outperforms S1 on solar fraction (39.4% vs 38.8%) and CO₂ savings (220.5 vs 217.2 t/yr), its 35% round-trip efficiency penalty halves the operational cost saving relative to baseline (£17.4k vs £42.4k annually). At Eden Campus's demand scale and grid tariff structure, the longer storage duration of hydrogen is therefore not yet operationally rewarded. This is consistent with the techno-economic literature on hydrogen LDES viability at sub-MW scale [REF], where round-trip efficiency penalties are not offset by storage duration value at current commercial tariff structures. Hydrogen viability for commercial sites of this scale is likely to require either targeted policy support (capital grants, hydrogen production credits) or significant electrolyser cost reductions [REF].</w:t>
+        <w:t>Comparison with hydrogen long-duration storage (S3) is particularly informative. While S3 marginally outperforms S1 on solar fraction (39.4% vs 38.8%) and CO₂ savings (220.5 vs 217.2 t/yr), its 35% round-trip efficiency penalty halves the operational cost saving relative to baseline (£17.4k vs £70.9k annually). At Eden Campus's demand scale and grid tariff structure, the longer storage duration of hydrogen is therefore not yet operationally rewarded. This is consistent with the techno-economic literature on hydrogen LDES viability at sub-MW scale [REF], where round-trip efficiency penalties are not offset by storage duration value at current commercial tariff structures. Hydrogen viability for commercial sites of this scale is likely to require either targeted policy support (capital grants, hydrogen production credits) or significant electrolyser cost reductions [REF].</w:t>
       </w:r>
     </w:p>
     <w:p>
@@ -10638,7 +10638,7 @@
           <w:sz w:val="22"/>
           <w:szCs w:val="22"/>
         </w:rPr>
-        <w:t xml:space="preserve">Lithium-ion battery storage paired with solar PV (S1) delivers a 38.8% solar fraction, 217.2 tonnes of CO₂ savings annually, and £42,400 in annual operational cost savings against the unstored baseline — equivalent to £847,000 over a 20-year asset lifetime. No other configuration combines low operational cost with strong CO₂ savings and zero peak demand penalty.</w:t>
+        <w:t>Lithium-ion battery storage paired with solar PV (S1) delivers a 38.8% solar fraction, 217.2 tonnes of CO₂ savings annually, and £70,900 in annual operational cost savings against the unstored baseline — equivalent to £1,418,000 over a 20-year asset lifetime. No other configuration combines low operational cost with strong CO₂ savings and zero peak demand penalty.</w:t>
       </w:r>
     </w:p>
     <w:p>

</xml_diff>

<commit_message>
Reframe heat-pump peak finding as tariff-dependent; fix S3 cost; state tariff basis
Adopt the capacity-charge tariff (GBP120/kW/yr) as the paper's primary basis and
reconcile all tariff-dependent claims to it (verified by dual-tariff full-year runs):
- Heat-pump peak finding reframed from an unconditional '+32% increase' to the
  verified tariff-dependent result: +32.7% under an energy-only tariff (671.9->904.4
  kW for S2/S4), neutralised (S2 ~0%) or reversed (S4 -40%) under the capacity
  charge. Updated abstract, highlights, novel-findings list, discussion, conclusion
  and Figure 4 caption.
- S3 operational cost saving 17.4k -> 23.4k (charge-ON basis, matches S1's basis).
- Added a methods statement making GBP120/kW/yr the primary tariff for all KPIs,
  with the energy-only variant as an explicit sensitivity.
Solar fractions and CO2 (tariff-invariant) unchanged and previously verified.
</commit_message>
<xml_diff>
--- a/EdenCampus_PhD/05_papers/paper1/Paper1_Eden_Campus_Manuscript.docx
+++ b/EdenCampus_PhD/05_papers/paper1/Paper1_Eden_Campus_Manuscript.docx
@@ -89,7 +89,7 @@
           <w:sz w:val="22"/>
           <w:szCs w:val="22"/>
         </w:rPr>
-        <w:t>Business parks represent a significant yet under-studied opportunity for commercial decarbonisation, particularly in cool-temperate climates where renewable generation and demand profiles are temporally misaligned. This paper presents a multi-vector digital twin framework for evaluating distributed energy storage configurations in business parks, using Eden Campus in Fife, Scotland as a case study. A four-layer architecture integrates real-time data acquisition, physics-based component modelling, multi-objective optimisation through PyPSA, and stakeholder visualisation, enabling rigorous comparison across storage technologies. Five system configurations are evaluated over 8,760 hours of optimised dispatch: solar PV only (S0), PV with lithium-ion battery (S1), PV with phase-change thermal storage (S2), PV with hydrogen long-duration storage (S3), and a full hybrid system combining all three storage types (S4). Results show that S1 (PV+BESS) is the operationally optimal configuration, achieving 38.8% annual solar fraction, 217.2 tonnes of CO₂ savings per year, and £70,900 in annual operational cost savings against the PV-only baseline — equivalent to £1,418,000 over a 20-year asset lifetime. Sensitivity analysis across four weather years (2020–2023), grid prices spanning £180–380/MWh, and BESS capacities from 200 to 4,000 kWh confirms result robustness. A novel finding is that scenarios involving heat pump electrification (S2 and S4) increase electrical peak demand by 32%, revealing a previously under-reported trade-off between thermal decarbonisation and electrical grid impact. The framework provides a reproducible decision-support tool for net-zero planning in commercial real estate.</w:t>
+        <w:t>Business parks represent a significant yet under-studied opportunity for commercial decarbonisation, particularly in cool-temperate climates where renewable generation and demand profiles are temporally misaligned. This paper presents a multi-vector digital twin framework for evaluating distributed energy storage configurations in business parks, using Eden Campus in Fife, Scotland as a case study. A four-layer architecture integrates real-time data acquisition, physics-based component modelling, multi-objective optimisation through PyPSA, and stakeholder visualisation, enabling rigorous comparison across storage technologies. Five system configurations are evaluated over 8,760 hours of optimised dispatch: solar PV only (S0), PV with lithium-ion battery (S1), PV with phase-change thermal storage (S2), PV with hydrogen long-duration storage (S3), and a full hybrid system combining all three storage types (S4). Results show that S1 (PV+BESS) is the operationally optimal configuration, achieving 38.8% annual solar fraction, 217.2 tonnes of CO₂ savings per year, and £70,900 in annual operational cost savings against the PV-only baseline — equivalent to £1,418,000 over a 20-year asset lifetime. Sensitivity analysis across four weather years (2020–2023), grid prices spanning £180–380/MWh, and BESS capacities from 200 to 4,000 kWh confirms result robustness. A novel finding is tariff-dependent: under an energy-only tariff, heat pump electrification (S2 and S4) raises peak grid import by 32.7% above the unstored baseline, but this penalty is neutralised or reversed once a capacity/demand charge induces active peak management — a previously under-reported trade-off between thermal decarbonisation and electrical grid impact that only a multi-vector, tariff-aware model surfaces. The framework provides a reproducible decision-support tool for net-zero planning in commercial real estate.</w:t>
       </w:r>
     </w:p>
     <w:p>
@@ -216,7 +216,7 @@
           <w:sz w:val="22"/>
           <w:szCs w:val="22"/>
         </w:rPr>
-        <w:t xml:space="preserve">Heat pump scenarios reveal under-reported 32% electrical peak increase trade-off</w:t>
+        <w:t>Heat pump scenarios raise peak grid import 32.7% under energy-only billing; a capacity charge neutralises the penalty</w:t>
       </w:r>
     </w:p>
     <w:p>
@@ -467,7 +467,7 @@
           <w:sz w:val="22"/>
           <w:szCs w:val="22"/>
         </w:rPr>
-        <w:t xml:space="preserve">the analysis surfaces a previously under-reported electrical peak penalty associated with heat pump electrification (peak grid imports increase by 32% in scenarios with heat pump deployment), alongside two design-relevant findings on BESS sizing and methodological bias in representative-period studies.</w:t>
+        <w:t>the analysis surfaces a previously under-reported, tariff-dependent electrical peak penalty associated with heat pump electrification (under an energy-only tariff, peak grid imports rise 32.7% in heat-pump scenarios; a capacity/demand charge neutralises or reverses this), alongside two design-relevant findings on BESS sizing and methodological bias in representative-period studies.</w:t>
       </w:r>
     </w:p>
     <w:p>
@@ -1157,7 +1157,7 @@
           <w:sz w:val="22"/>
           <w:szCs w:val="22"/>
         </w:rPr>
-        <w:t xml:space="preserve">For thermal demand, an air-source heat pump is modelled with seasonal coefficient of performance (COP) of 3.0, alongside a backup gas boiler with marginal cost of £110/MWh. The grid connection is modelled with a 2,000 kW import limit at the UK 2024 commercial tariff of £280/MWh, 500 kW export capacity at £50/MWh consistent with typical Smart Export Guarantee rates, and an average grid carbon intensity of 0.233 kgCO₂/kWh [REF].</w:t>
+        <w:t>For thermal demand, an air-source heat pump is modelled with seasonal coefficient of performance (COP) of 3.0, alongside a backup gas boiler with marginal cost of £110/MWh. The grid connection is modelled with a 2,000 kW import limit at the UK 2024 commercial tariff of £280/MWh, 500 kW export capacity at £50/MWh consistent with typical Smart Export Guarantee rates, and an average grid carbon intensity of 0.233 kgCO₂/kWh [REF]. In addition to the per-kWh energy tariff, a capacity/demand charge of £120/kW/yr is applied to the peak grid import, consistent with UK commercial DUoS/agreed-supply-capacity billing. This capacity-charge tariff is the primary basis for all reported KPIs; an energy-only variant (capacity charge set to zero) is used as an explicit tariff sensitivity where noted, since the two regimes give materially different peak-management behaviour.</w:t>
       </w:r>
     </w:p>
     <w:p>
@@ -9322,7 +9322,7 @@
           <w:sz w:val="22"/>
           <w:szCs w:val="22"/>
         </w:rPr>
-        <w:t xml:space="preserve">Hydrogen long-duration storage (S3) achieves a marginally higher solar fraction of 39.4% than S1 (Figure 4, panel a), driven by its capacity for seasonal energy shifting visible in the monthly breakdown (Figure 5). However, the 35% round-trip efficiency of the electrolyser–fuel cell pathway penalises overall energy throughput, yielding a smaller operational cost reduction (£17.4k versus S0) than the more efficient battery configuration.</w:t>
+        <w:t>Hydrogen long-duration storage (S3) achieves a marginally higher solar fraction of 39.4% than S1 (Figure 4, panel a), driven by its capacity for seasonal energy shifting visible in the monthly breakdown (Figure 5). However, the 35% round-trip efficiency of the electrolyser–fuel cell pathway penalises overall energy throughput, yielding a smaller operational cost reduction (£23.4k versus S0) than the more efficient battery configuration.</w:t>
       </w:r>
     </w:p>
     <w:p>
@@ -10399,7 +10399,7 @@
           <w:sz w:val="22"/>
           <w:szCs w:val="22"/>
         </w:rPr>
-        <w:t>Comparison with hydrogen long-duration storage (S3) is particularly informative. While S3 marginally outperforms S1 on solar fraction (39.4% vs 38.8%) and CO₂ savings (220.5 vs 217.2 t/yr), its 35% round-trip efficiency penalty halves the operational cost saving relative to baseline (£17.4k vs £70.9k annually). At Eden Campus's demand scale and grid tariff structure, the longer storage duration of hydrogen is therefore not yet operationally rewarded. This is consistent with the techno-economic literature on hydrogen LDES viability at sub-MW scale [REF], where round-trip efficiency penalties are not offset by storage duration value at current commercial tariff structures. Hydrogen viability for commercial sites of this scale is likely to require either targeted policy support (capital grants, hydrogen production credits) or significant electrolyser cost reductions [REF].</w:t>
+        <w:t>Comparison with hydrogen long-duration storage (S3) is particularly informative. While S3 marginally outperforms S1 on solar fraction (39.4% vs 38.8%) and CO₂ savings (220.5 vs 217.2 t/yr), its 35% round-trip efficiency penalty halves the operational cost saving relative to baseline (£23.4k vs £70.9k annually). At Eden Campus's demand scale and grid tariff structure, the longer storage duration of hydrogen is therefore not yet operationally rewarded. This is consistent with the techno-economic literature on hydrogen LDES viability at sub-MW scale [REF], where round-trip efficiency penalties are not offset by storage duration value at current commercial tariff structures. Hydrogen viability for commercial sites of this scale is likely to require either targeted policy support (capital grants, hydrogen production credits) or significant electrolyser cost reductions [REF].</w:t>
       </w:r>
     </w:p>
     <w:p>
@@ -10429,7 +10429,7 @@
           <w:sz w:val="22"/>
           <w:szCs w:val="22"/>
         </w:rPr>
-        <w:t xml:space="preserve">Scenarios involving heat pump electrification (S2 and S4) reveal a previously under-reported finding of significance for net-zero planning. While these configurations achieve the highest renewable generation (S4: 1,025 MWh/yr) and the highest CO₂ savings (S4: 238.8 t/yr), they also drive peak grid imports above the unstored baseline by approximately 32%, rather than reducing it.</w:t>
+        <w:t>Scenarios involving heat pump electrification (S2 and S4) reveal a previously under-reported, tariff-dependent finding of significance for net-zero planning. While these configurations achieve the highest renewable generation (S4: 1,025 MWh/yr) and the highest CO₂ savings (S4: 238.8 t/yr), their effect on peak grid import depends critically on the tariff structure. Under an energy-only tariff (no capacity/demand charge), heat pump operation drives peak grid imports 32.7% above the unstored baseline (671.9 kW → 904.4 kW for both S2 and S4), because heat-pump load concentrates in low-solar winter-evening periods that coincide with existing demand peaks. Under the realistic UK commercial capacity/demand charge (£120/kW/yr) used as this study's primary basis, however, the optimiser actively manages that peak: the penalty is neutralised in S2 (≈1.4% change from baseline) and reversed in S4, where the co-located battery shaves peak import by ~40%. The finding is therefore twofold — heat-pump electrification introduces a latent peak penalty that is invisible under flat energy-only billing, and a capacity-based tariff both exposes the underlying risk and provides the incentive to mitigate it.</w:t>
       </w:r>
     </w:p>
     <w:p>
@@ -10652,7 +10652,7 @@
           <w:sz w:val="22"/>
           <w:szCs w:val="22"/>
         </w:rPr>
-        <w:t xml:space="preserve">Scenarios involving heat pump electrification (S2 and S4) increase electrical peak demand by approximately 32%, revealing a trade-off between thermal decarbonisation and electrical grid impact that single-vector studies have largely missed. This finding has direct implications for both system designers and Distribution Network Operators planning portfolio-level heat pump deployment.</w:t>
+        <w:t>Under an energy-only tariff, scenarios involving heat pump electrification (S2 and S4) raise peak grid import by approximately 33%, revealing a trade-off between thermal decarbonisation and electrical grid impact that single-vector studies have largely missed; a capacity/demand charge neutralises or reverses this penalty by inducing active peak management. This tariff-dependent finding has direct implications for both system designers and Distribution Network Operators planning portfolio-level heat pump deployment.</w:t>
       </w:r>
     </w:p>
     <w:p>
@@ -10825,7 +10825,7 @@
           <w:sz w:val="22"/>
           <w:szCs w:val="22"/>
         </w:rPr>
-        <w:t xml:space="preserve">Annual KPI comparison across the five storage configurations (S0: PV Only, S1: PV+BESS, S2: PV+PCM TES, S3: PV+H₂ LDES, S4: Full Hybrid) for the 2023 weather year. Panels show: (a) solar fraction; (b) PV self-consumption rate; (c) annual CO₂ savings; (d) annual grid import; (e) peak demand reduction relative to S0; and (f) annual operational cost. The dashed reference line in panels (a), (d), and (f) marks the S0 baseline. Battery storage (S1) achieves the lowest cost while delivering near-best solar fraction and CO₂ savings; heat pump scenarios (S2, S4) show negative peak reduction, indicating an increase in peak grid demand relative to baseline.</w:t>
+        <w:t>Annual KPI comparison across the five storage configurations (S0: PV Only, S1: PV+BESS, S2: PV+PCM TES, S3: PV+H₂ LDES, S4: Full Hybrid) for the 2023 weather year. Panels show: (a) solar fraction; (b) PV self-consumption rate; (c) annual CO₂ savings; (d) annual grid import; (e) peak demand reduction relative to S0; and (f) annual operational cost. The dashed reference line in panels (a), (d), and (f) marks the S0 baseline. Battery storage (S1) achieves the lowest cost while delivering near-best solar fraction and CO₂ savings; under the primary capacity-charge tariff, heat pump scenarios (S2, S4) do not increase peak grid demand (the penalty seen under energy-only billing is actively managed away); see Section 6 for the tariff-dependent analysis.</w:t>
       </w:r>
     </w:p>
     <w:p>

</xml_diff>

<commit_message>
Paper 1: resolve 'measured site data' framing — clarify DT ingests measured-or-modelled data (this study modelled)
</commit_message>
<xml_diff>
--- a/EdenCampus_PhD/05_papers/paper1/Paper1_Eden_Campus_Manuscript.docx
+++ b/EdenCampus_PhD/05_papers/paper1/Paper1_Eden_Campus_Manuscript.docx
@@ -325,7 +325,7 @@
           <w:sz w:val="22"/>
           <w:szCs w:val="22"/>
         </w:rPr>
-        <w:t xml:space="preserve">Digital twin (DT) methodologies have emerged as a promising decision-support paradigm for energy systems planning. By coupling physics-based component models with measured site data and optimisation algorithms, DTs enable scenario analysis grounded in real-world operating conditions and transferable across sites of similar profile. The DT concept has matured rapidly in adjacent domains — manufacturing, aviation, and grid-scale power systems — and is now being adapted for commercial-scale energy applications.</w:t>
+        <w:t>Digital twin (DT) methodologies have emerged as a promising decision-support paradigm for energy systems planning. By coupling physics-based component models with site data — measured where available, or transparently modelled — and optimisation algorithms, DTs enable scenario analysis grounded in real-world operating conditions and transferable across sites of similar profile. The DT concept has matured rapidly in adjacent domains — manufacturing, aviation, and grid-scale power systems — and is now being adapted for commercial-scale energy applications.</w:t>
       </w:r>
     </w:p>
     <w:p>
@@ -829,7 +829,7 @@
           <w:sz w:val="22"/>
           <w:szCs w:val="22"/>
         </w:rPr>
-        <w:t xml:space="preserve">The data acquisition layer ingests measured site data and external time-series inputs at hourly resolution, including electrical and thermal demand profiles, solar irradiance and ambient temperature from the European Photovoltaic Geographical Information System (PVGIS) [REF], grid carbon intensity from National Grid ESO [REF], and tariff structures from commercial supply contracts. The physics-based modelling layer translates these inputs into engineering-meaningful component representations: solar PV generation through the open-source pvlib library [REF] using the temperature-corrected single-diode model; battery, thermal and hydrogen storage as state-of-charge dynamic systems with explicit round-trip efficiency, standing loss, and capacity constraints. The optimisation and control layer performs hourly dispatch decisions using PyPSA [REF], an open-source linear programming framework for energy systems analysis, selected for its mature multi-vector capabilities and native support for both representative-period and full-year simulation. The visualisation layer translates optimisation outputs into stakeholder-relevant key performance indicators and decision-support visualisations; while the framework supports interactive dashboard deployment, the present study reports static research outputs to enable comparative scenario analysis.</w:t>
+        <w:t>The data acquisition layer ingests site data (measured where available; in this study, transparently modelled — see Section 4.3) and external time-series inputs at hourly resolution, including electrical and thermal demand profiles, solar irradiance and ambient temperature from the European Photovoltaic Geographical Information System (PVGIS) [REF], grid carbon intensity from National Grid ESO [REF], and tariff structures from commercial supply contracts. The physics-based modelling layer translates these inputs into engineering-meaningful component representations: solar PV generation through the open-source pvlib library [REF] using the temperature-corrected single-diode model; battery, thermal and hydrogen storage as state-of-charge dynamic systems with explicit round-trip efficiency, standing loss, and capacity constraints. The optimisation and control layer performs hourly dispatch decisions using PyPSA [REF], an open-source linear programming framework for energy systems analysis, selected for its mature multi-vector capabilities and native support for both representative-period and full-year simulation. The visualisation layer translates optimisation outputs into stakeholder-relevant key performance indicators and decision-support visualisations; while the framework supports interactive dashboard deployment, the present study reports static research outputs to enable comparative scenario analysis.</w:t>
       </w:r>
     </w:p>
     <w:p>

</xml_diff>